<commit_message>
Add Vanderbilt author identity to title page
Affiliation: Vanderbilt Divinity School, Vanderbilt University (Nashville, TN);
email limin.hou@vanderbilt.edu; ORCID registration pending.

Co-Authored-By: Claude Opus 4.7 <noreply@anthropic.com>
</commit_message>
<xml_diff>
--- a/job_mencius_paper_title_page.docx
+++ b/job_mencius_paper_title_page.docx
@@ -72,60 +72,54 @@
       <w:r>
         <w:rPr>
           <w:rFonts w:ascii="Times New Roman" w:cs="Times New Roman" w:eastAsia="Times New Roman" w:hAnsi="Times New Roman"/>
+          <w:sz w:val="24"/>
+          <w:szCs w:val="24"/>
+        </w:rPr>
+        <w:t xml:space="preserve">Vanderbilt Divinity School, Vanderbilt University</w:t>
+      </w:r>
+    </w:p>
+    <w:p>
+      <w:pPr>
+        <w:spacing w:after="60" w:line="480" w:lineRule="auto"/>
+        <w:jc w:val="center"/>
+      </w:pPr>
+      <w:r>
+        <w:rPr>
+          <w:rFonts w:ascii="Times New Roman" w:cs="Times New Roman" w:eastAsia="Times New Roman" w:hAnsi="Times New Roman"/>
+          <w:sz w:val="24"/>
+          <w:szCs w:val="24"/>
+        </w:rPr>
+        <w:t xml:space="preserve">Nashville, Tennessee, USA</w:t>
+      </w:r>
+    </w:p>
+    <w:p>
+      <w:pPr>
+        <w:spacing w:after="60" w:line="480" w:lineRule="auto"/>
+        <w:jc w:val="center"/>
+      </w:pPr>
+      <w:r>
+        <w:rPr>
+          <w:rFonts w:ascii="Times New Roman" w:cs="Times New Roman" w:eastAsia="Times New Roman" w:hAnsi="Times New Roman"/>
+          <w:sz w:val="24"/>
+          <w:szCs w:val="24"/>
+        </w:rPr>
+        <w:t xml:space="preserve">limin.hou@vanderbilt.edu</w:t>
+      </w:r>
+    </w:p>
+    <w:p>
+      <w:pPr>
+        <w:spacing w:after="480" w:line="480" w:lineRule="auto"/>
+        <w:jc w:val="center"/>
+      </w:pPr>
+      <w:r>
+        <w:rPr>
+          <w:rFonts w:ascii="Times New Roman" w:cs="Times New Roman" w:eastAsia="Times New Roman" w:hAnsi="Times New Roman"/>
           <w:i/>
           <w:iCs/>
           <w:sz w:val="24"/>
           <w:szCs w:val="24"/>
         </w:rPr>
-        <w:t xml:space="preserve">[Department / Institution — to be supplied]</w:t>
-      </w:r>
-    </w:p>
-    <w:p>
-      <w:pPr>
-        <w:spacing w:after="60" w:line="480" w:lineRule="auto"/>
-        <w:jc w:val="center"/>
-      </w:pPr>
-      <w:r>
-        <w:rPr>
-          <w:rFonts w:ascii="Times New Roman" w:cs="Times New Roman" w:eastAsia="Times New Roman" w:hAnsi="Times New Roman"/>
-          <w:i/>
-          <w:iCs/>
-          <w:sz w:val="24"/>
-          <w:szCs w:val="24"/>
-        </w:rPr>
-        <w:t xml:space="preserve">[City, Country]</w:t>
-      </w:r>
-    </w:p>
-    <w:p>
-      <w:pPr>
-        <w:spacing w:after="60" w:line="480" w:lineRule="auto"/>
-        <w:jc w:val="center"/>
-      </w:pPr>
-      <w:r>
-        <w:rPr>
-          <w:rFonts w:ascii="Times New Roman" w:cs="Times New Roman" w:eastAsia="Times New Roman" w:hAnsi="Times New Roman"/>
-          <w:i/>
-          <w:iCs/>
-          <w:sz w:val="24"/>
-          <w:szCs w:val="24"/>
-        </w:rPr>
-        <w:t xml:space="preserve">[Email address]</w:t>
-      </w:r>
-    </w:p>
-    <w:p>
-      <w:pPr>
-        <w:spacing w:after="480" w:line="480" w:lineRule="auto"/>
-        <w:jc w:val="center"/>
-      </w:pPr>
-      <w:r>
-        <w:rPr>
-          <w:rFonts w:ascii="Times New Roman" w:cs="Times New Roman" w:eastAsia="Times New Roman" w:hAnsi="Times New Roman"/>
-          <w:i/>
-          <w:iCs/>
-          <w:sz w:val="24"/>
-          <w:szCs w:val="24"/>
-        </w:rPr>
-        <w:t xml:space="preserve">[ORCID iD]</w:t>
+        <w:t xml:space="preserve">ORCID iD: to be supplied (free registration at orcid.org)</w:t>
       </w:r>
     </w:p>
     <w:p>

</xml_diff>

<commit_message>
Add author ORCID iD to title page
Slot in ORCID 0009-0001-8611-6471, replacing the placeholder.

Co-Authored-By: Claude Opus 4.7 <noreply@anthropic.com>
</commit_message>
<xml_diff>
--- a/job_mencius_paper_title_page.docx
+++ b/job_mencius_paper_title_page.docx
@@ -114,12 +114,10 @@
       <w:r>
         <w:rPr>
           <w:rFonts w:ascii="Times New Roman" w:cs="Times New Roman" w:eastAsia="Times New Roman" w:hAnsi="Times New Roman"/>
-          <w:i/>
-          <w:iCs/>
-          <w:sz w:val="24"/>
-          <w:szCs w:val="24"/>
-        </w:rPr>
-        <w:t xml:space="preserve">ORCID iD: to be supplied (free registration at orcid.org)</w:t>
+          <w:sz w:val="24"/>
+          <w:szCs w:val="24"/>
+        </w:rPr>
+        <w:t xml:space="preserve">ORCID iD: https://orcid.org/0009-0001-8611-6471</w:t>
       </w:r>
     </w:p>
     <w:p>

</xml_diff>